<commit_message>
change to nodejs with hoidanit
</commit_message>
<xml_diff>
--- a/Base.docx
+++ b/Base.docx
@@ -1127,152 +1127,22 @@
     </w:p>
     <w:p/>
     <w:p>
-      <w:pPr>
-        <w:rPr>
-          <w:b/>
-          <w:bCs/>
-        </w:rPr>
-      </w:pPr>
-      <w:r>
-        <w:rPr>
-          <w:b/>
-          <w:bCs/>
-        </w:rPr>
+      <w:r>
         <w:lastRenderedPageBreak/>
-        <w:t>- Chạy server</w:t>
-      </w:r>
-      <w:r>
-        <w:rPr>
-          <w:b/>
-          <w:bCs/>
-        </w:rPr>
-        <w:t>:</w:t>
-      </w:r>
-      <w:r>
-        <w:rPr>
-          <w:b/>
-          <w:bCs/>
-        </w:rPr>
-        <w:t xml:space="preserve"> </w:t>
-      </w:r>
-      <w:r>
-        <w:rPr>
-          <w:b/>
-          <w:bCs/>
-          <w:color w:val="FF0000"/>
-        </w:rPr>
-        <w:t>node index.js</w:t>
-      </w:r>
-    </w:p>
-    <w:p>
-      <w:pPr>
-        <w:rPr>
-          <w:b/>
-          <w:bCs/>
-        </w:rPr>
-      </w:pPr>
-    </w:p>
-    <w:p>
-      <w:pPr>
-        <w:jc w:val="center"/>
-        <w:rPr>
-          <w:b/>
-          <w:bCs/>
-          <w:sz w:val="36"/>
-          <w:szCs w:val="36"/>
-        </w:rPr>
-      </w:pPr>
-      <w:r>
-        <w:rPr>
-          <w:b/>
-          <w:bCs/>
-          <w:sz w:val="36"/>
-          <w:szCs w:val="36"/>
-        </w:rPr>
-        <w:t>Lib</w:t>
-      </w:r>
-      <w:r>
-        <w:rPr>
-          <w:b/>
-          <w:bCs/>
-          <w:sz w:val="36"/>
-          <w:szCs w:val="36"/>
-        </w:rPr>
-        <w:t>rary</w:t>
-      </w:r>
-    </w:p>
-    <w:p>
-      <w:r>
-        <w:t>- Cài thư viện nodemon (lắng nghe sự thay đổi)</w:t>
-      </w:r>
-    </w:p>
-    <w:p>
-      <w:pPr>
-        <w:rPr>
-          <w:b/>
-          <w:bCs/>
-          <w:color w:val="FF0000"/>
-        </w:rPr>
-      </w:pPr>
-      <w:r>
-        <w:tab/>
-      </w:r>
-      <w:r>
-        <w:rPr>
-          <w:b/>
-          <w:bCs/>
-          <w:color w:val="FF0000"/>
-        </w:rPr>
-        <w:t>npm install nodemon --save-d</w:t>
-      </w:r>
-    </w:p>
-    <w:p>
-      <w:pPr>
-        <w:rPr>
-          <w:b/>
-          <w:bCs/>
-          <w:color w:val="FF0000"/>
-        </w:rPr>
-      </w:pPr>
-    </w:p>
-    <w:p>
-      <w:r>
-        <w:rPr>
-          <w:b/>
-          <w:bCs/>
-          <w:color w:val="FF0000"/>
-        </w:rPr>
-        <w:tab/>
-      </w:r>
-      <w:r>
-        <w:rPr>
-          <w:color w:val="FF0000"/>
-        </w:rPr>
-        <w:t>(optional)</w:t>
-      </w:r>
-      <w:r>
-        <w:rPr>
-          <w:b/>
-          <w:bCs/>
-          <w:color w:val="FF0000"/>
-        </w:rPr>
-        <w:t xml:space="preserve"> </w:t>
-      </w:r>
-      <w:r>
-        <w:t xml:space="preserve">Tại </w:t>
+        <w:t xml:space="preserve">- tạo </w:t>
       </w:r>
       <w:proofErr w:type="gramStart"/>
       <w:r>
-        <w:rPr>
-          <w:b/>
-          <w:bCs/>
-        </w:rPr>
-        <w:t>package.json</w:t>
+        <w:t xml:space="preserve">file </w:t>
+      </w:r>
+      <w:r>
+        <w:rPr>
+          <w:b/>
+          <w:bCs/>
+        </w:rPr>
+        <w:t>.gitignore</w:t>
       </w:r>
       <w:proofErr w:type="gramEnd"/>
-      <w:r>
-        <w:t xml:space="preserve"> thêm nội dung</w:t>
-      </w:r>
     </w:p>
     <w:p>
       <w:pPr>
@@ -1286,45 +1156,17 @@
           <w:szCs w:val="21"/>
         </w:rPr>
       </w:pPr>
-      <w:r>
-        <w:t xml:space="preserve">     </w:t>
-      </w:r>
-      <w:r>
-        <w:rPr>
-          <w:rFonts w:ascii="Consolas" w:eastAsia="Times New Roman" w:hAnsi="Consolas" w:cs="Times New Roman"/>
-          <w:color w:val="9CDCFE"/>
-          <w:sz w:val="21"/>
-          <w:szCs w:val="21"/>
-        </w:rPr>
-        <w:t>"scripts"</w:t>
-      </w:r>
-      <w:r>
-        <w:rPr>
-          <w:rFonts w:ascii="Consolas" w:eastAsia="Times New Roman" w:hAnsi="Consolas" w:cs="Times New Roman"/>
-          <w:color w:val="B4B4B4"/>
-          <w:sz w:val="21"/>
-          <w:szCs w:val="21"/>
-        </w:rPr>
-        <w:t>:</w:t>
-      </w:r>
-      <w:r>
-        <w:rPr>
-          <w:rFonts w:ascii="Consolas" w:eastAsia="Times New Roman" w:hAnsi="Consolas" w:cs="Times New Roman"/>
-          <w:color w:val="DADADA"/>
-          <w:sz w:val="21"/>
-          <w:szCs w:val="21"/>
-        </w:rPr>
-        <w:t xml:space="preserve"> </w:t>
-      </w:r>
-      <w:r>
-        <w:rPr>
-          <w:rFonts w:ascii="Consolas" w:eastAsia="Times New Roman" w:hAnsi="Consolas" w:cs="Times New Roman"/>
-          <w:color w:val="B4B4B4"/>
-          <w:sz w:val="21"/>
-          <w:szCs w:val="21"/>
-        </w:rPr>
-        <w:t>{</w:t>
-      </w:r>
+      <w:proofErr w:type="gramStart"/>
+      <w:r>
+        <w:rPr>
+          <w:rFonts w:ascii="Consolas" w:eastAsia="Times New Roman" w:hAnsi="Consolas" w:cs="Times New Roman"/>
+          <w:color w:val="DADADA"/>
+          <w:sz w:val="21"/>
+          <w:szCs w:val="21"/>
+        </w:rPr>
+        <w:t>.vscode</w:t>
+      </w:r>
+      <w:proofErr w:type="gramEnd"/>
     </w:p>
     <w:p>
       <w:pPr>
@@ -1345,7 +1187,243 @@
           <w:sz w:val="21"/>
           <w:szCs w:val="21"/>
         </w:rPr>
-        <w:t xml:space="preserve">    </w:t>
+        <w:t>node_modules/</w:t>
+      </w:r>
+    </w:p>
+    <w:p/>
+    <w:p>
+      <w:r>
+        <w:t xml:space="preserve">- Move file </w:t>
+      </w:r>
+      <w:r>
+        <w:rPr>
+          <w:b/>
+          <w:bCs/>
+        </w:rPr>
+        <w:t>index.js</w:t>
+      </w:r>
+      <w:r>
+        <w:t xml:space="preserve"> (vào thư mục </w:t>
+      </w:r>
+      <w:r>
+        <w:rPr>
+          <w:b/>
+          <w:bCs/>
+        </w:rPr>
+        <w:t>src</w:t>
+      </w:r>
+      <w:r>
+        <w:t>), sửa lại</w:t>
+      </w:r>
+      <w:r>
+        <w:rPr>
+          <w:b/>
+          <w:bCs/>
+        </w:rPr>
+        <w:t xml:space="preserve"> </w:t>
+      </w:r>
+      <w:proofErr w:type="gramStart"/>
+      <w:r>
+        <w:rPr>
+          <w:b/>
+          <w:bCs/>
+        </w:rPr>
+        <w:t>package.json</w:t>
+      </w:r>
+      <w:proofErr w:type="gramEnd"/>
+    </w:p>
+    <w:p/>
+    <w:p>
+      <w:pPr>
+        <w:jc w:val="center"/>
+        <w:rPr>
+          <w:b/>
+          <w:bCs/>
+          <w:sz w:val="36"/>
+          <w:szCs w:val="36"/>
+        </w:rPr>
+      </w:pPr>
+      <w:r>
+        <w:rPr>
+          <w:b/>
+          <w:bCs/>
+          <w:sz w:val="36"/>
+          <w:szCs w:val="36"/>
+        </w:rPr>
+        <w:t>Run</w:t>
+      </w:r>
+    </w:p>
+    <w:p>
+      <w:pPr>
+        <w:rPr>
+          <w:b/>
+          <w:bCs/>
+        </w:rPr>
+      </w:pPr>
+      <w:r>
+        <w:rPr>
+          <w:b/>
+          <w:bCs/>
+        </w:rPr>
+        <w:t>- Chạy server</w:t>
+      </w:r>
+      <w:r>
+        <w:rPr>
+          <w:b/>
+          <w:bCs/>
+        </w:rPr>
+        <w:t>:</w:t>
+      </w:r>
+      <w:r>
+        <w:rPr>
+          <w:b/>
+          <w:bCs/>
+        </w:rPr>
+        <w:t xml:space="preserve"> </w:t>
+      </w:r>
+      <w:r>
+        <w:rPr>
+          <w:b/>
+          <w:bCs/>
+          <w:color w:val="FF0000"/>
+        </w:rPr>
+        <w:t>node index.js</w:t>
+      </w:r>
+    </w:p>
+    <w:p>
+      <w:pPr>
+        <w:rPr>
+          <w:b/>
+          <w:bCs/>
+        </w:rPr>
+      </w:pPr>
+    </w:p>
+    <w:p>
+      <w:pPr>
+        <w:jc w:val="center"/>
+        <w:rPr>
+          <w:b/>
+          <w:bCs/>
+          <w:sz w:val="36"/>
+          <w:szCs w:val="36"/>
+        </w:rPr>
+      </w:pPr>
+      <w:r>
+        <w:rPr>
+          <w:b/>
+          <w:bCs/>
+          <w:sz w:val="36"/>
+          <w:szCs w:val="36"/>
+        </w:rPr>
+        <w:t>Lib</w:t>
+      </w:r>
+      <w:r>
+        <w:rPr>
+          <w:b/>
+          <w:bCs/>
+          <w:sz w:val="36"/>
+          <w:szCs w:val="36"/>
+        </w:rPr>
+        <w:t>rary</w:t>
+      </w:r>
+    </w:p>
+    <w:p>
+      <w:r>
+        <w:t xml:space="preserve">- Cài thư viện </w:t>
+      </w:r>
+      <w:r>
+        <w:rPr>
+          <w:b/>
+          <w:bCs/>
+        </w:rPr>
+        <w:t xml:space="preserve">nodemon </w:t>
+      </w:r>
+      <w:r>
+        <w:t>(lắng nghe sự thay đổi)</w:t>
+      </w:r>
+    </w:p>
+    <w:p>
+      <w:pPr>
+        <w:rPr>
+          <w:b/>
+          <w:bCs/>
+          <w:color w:val="FF0000"/>
+        </w:rPr>
+      </w:pPr>
+      <w:r>
+        <w:tab/>
+      </w:r>
+      <w:r>
+        <w:rPr>
+          <w:b/>
+          <w:bCs/>
+          <w:color w:val="FF0000"/>
+        </w:rPr>
+        <w:t>npm install nodemon --save-d</w:t>
+      </w:r>
+    </w:p>
+    <w:p>
+      <w:pPr>
+        <w:rPr>
+          <w:b/>
+          <w:bCs/>
+          <w:color w:val="FF0000"/>
+        </w:rPr>
+      </w:pPr>
+    </w:p>
+    <w:p>
+      <w:r>
+        <w:rPr>
+          <w:b/>
+          <w:bCs/>
+          <w:color w:val="FF0000"/>
+        </w:rPr>
+        <w:tab/>
+      </w:r>
+      <w:r>
+        <w:rPr>
+          <w:color w:val="FF0000"/>
+        </w:rPr>
+        <w:t>(optional)</w:t>
+      </w:r>
+      <w:r>
+        <w:rPr>
+          <w:b/>
+          <w:bCs/>
+          <w:color w:val="FF0000"/>
+        </w:rPr>
+        <w:t xml:space="preserve"> </w:t>
+      </w:r>
+      <w:r>
+        <w:t xml:space="preserve">Tại </w:t>
+      </w:r>
+      <w:proofErr w:type="gramStart"/>
+      <w:r>
+        <w:rPr>
+          <w:b/>
+          <w:bCs/>
+        </w:rPr>
+        <w:t>package.json</w:t>
+      </w:r>
+      <w:proofErr w:type="gramEnd"/>
+      <w:r>
+        <w:t xml:space="preserve"> thêm nội dung</w:t>
+      </w:r>
+    </w:p>
+    <w:p>
+      <w:pPr>
+        <w:shd w:val="clear" w:color="auto" w:fill="1E1E1E"/>
+        <w:spacing w:line="285" w:lineRule="atLeast"/>
+        <w:ind w:left="720"/>
+        <w:rPr>
+          <w:rFonts w:ascii="Consolas" w:eastAsia="Times New Roman" w:hAnsi="Consolas" w:cs="Times New Roman"/>
+          <w:color w:val="DADADA"/>
+          <w:sz w:val="21"/>
+          <w:szCs w:val="21"/>
+        </w:rPr>
+      </w:pPr>
+      <w:r>
+        <w:t xml:space="preserve">     </w:t>
       </w:r>
       <w:r>
         <w:rPr>
@@ -1354,7 +1432,7 @@
           <w:sz w:val="21"/>
           <w:szCs w:val="21"/>
         </w:rPr>
-        <w:t>"start"</w:t>
+        <w:t>"scripts"</w:t>
       </w:r>
       <w:r>
         <w:rPr>
@@ -1377,38 +1455,11 @@
       <w:r>
         <w:rPr>
           <w:rFonts w:ascii="Consolas" w:eastAsia="Times New Roman" w:hAnsi="Consolas" w:cs="Times New Roman"/>
-          <w:color w:val="E8C9BB"/>
-          <w:sz w:val="21"/>
-          <w:szCs w:val="21"/>
-        </w:rPr>
-        <w:t>"</w:t>
-      </w:r>
-      <w:r>
-        <w:rPr>
-          <w:rFonts w:ascii="Consolas" w:eastAsia="Times New Roman" w:hAnsi="Consolas" w:cs="Times New Roman"/>
-          <w:color w:val="CE9178"/>
-          <w:sz w:val="21"/>
-          <w:szCs w:val="21"/>
-        </w:rPr>
-        <w:t>nodemon --inspect index.js</w:t>
-      </w:r>
-      <w:r>
-        <w:rPr>
-          <w:rFonts w:ascii="Consolas" w:eastAsia="Times New Roman" w:hAnsi="Consolas" w:cs="Times New Roman"/>
-          <w:color w:val="E8C9BB"/>
-          <w:sz w:val="21"/>
-          <w:szCs w:val="21"/>
-        </w:rPr>
-        <w:t>"</w:t>
-      </w:r>
-      <w:r>
-        <w:rPr>
-          <w:rFonts w:ascii="Consolas" w:eastAsia="Times New Roman" w:hAnsi="Consolas" w:cs="Times New Roman"/>
-          <w:color w:val="B4B4B4"/>
-          <w:sz w:val="21"/>
-          <w:szCs w:val="21"/>
-        </w:rPr>
-        <w:t>,</w:t>
+          <w:color w:val="B4B4B4"/>
+          <w:sz w:val="21"/>
+          <w:szCs w:val="21"/>
+        </w:rPr>
+        <w:t>{</w:t>
       </w:r>
     </w:p>
     <w:p>
@@ -1439,7 +1490,7 @@
           <w:sz w:val="21"/>
           <w:szCs w:val="21"/>
         </w:rPr>
-        <w:t>"test"</w:t>
+        <w:t>"start"</w:t>
       </w:r>
       <w:r>
         <w:rPr>
@@ -1475,43 +1526,7 @@
           <w:sz w:val="21"/>
           <w:szCs w:val="21"/>
         </w:rPr>
-        <w:t xml:space="preserve">echo </w:t>
-      </w:r>
-      <w:r>
-        <w:rPr>
-          <w:rFonts w:ascii="Consolas" w:eastAsia="Times New Roman" w:hAnsi="Consolas" w:cs="Times New Roman"/>
-          <w:color w:val="FFD68F"/>
-          <w:sz w:val="21"/>
-          <w:szCs w:val="21"/>
-        </w:rPr>
-        <w:t>\"</w:t>
-      </w:r>
-      <w:r>
-        <w:rPr>
-          <w:rFonts w:ascii="Consolas" w:eastAsia="Times New Roman" w:hAnsi="Consolas" w:cs="Times New Roman"/>
-          <w:color w:val="CE9178"/>
-          <w:sz w:val="21"/>
-          <w:szCs w:val="21"/>
-        </w:rPr>
-        <w:t>Error: no test specified</w:t>
-      </w:r>
-      <w:r>
-        <w:rPr>
-          <w:rFonts w:ascii="Consolas" w:eastAsia="Times New Roman" w:hAnsi="Consolas" w:cs="Times New Roman"/>
-          <w:color w:val="FFD68F"/>
-          <w:sz w:val="21"/>
-          <w:szCs w:val="21"/>
-        </w:rPr>
-        <w:t>\"</w:t>
-      </w:r>
-      <w:r>
-        <w:rPr>
-          <w:rFonts w:ascii="Consolas" w:eastAsia="Times New Roman" w:hAnsi="Consolas" w:cs="Times New Roman"/>
-          <w:color w:val="CE9178"/>
-          <w:sz w:val="21"/>
-          <w:szCs w:val="21"/>
-        </w:rPr>
-        <w:t xml:space="preserve"> &amp;&amp; exit 1</w:t>
+        <w:t>nodemon --inspect index.js</w:t>
       </w:r>
       <w:r>
         <w:rPr>
@@ -1521,6 +1536,15 @@
           <w:szCs w:val="21"/>
         </w:rPr>
         <w:t>"</w:t>
+      </w:r>
+      <w:r>
+        <w:rPr>
+          <w:rFonts w:ascii="Consolas" w:eastAsia="Times New Roman" w:hAnsi="Consolas" w:cs="Times New Roman"/>
+          <w:color w:val="B4B4B4"/>
+          <w:sz w:val="21"/>
+          <w:szCs w:val="21"/>
+        </w:rPr>
+        <w:t>,</w:t>
       </w:r>
     </w:p>
     <w:p>
@@ -1542,6 +1566,118 @@
           <w:sz w:val="21"/>
           <w:szCs w:val="21"/>
         </w:rPr>
+        <w:t xml:space="preserve">    </w:t>
+      </w:r>
+      <w:r>
+        <w:rPr>
+          <w:rFonts w:ascii="Consolas" w:eastAsia="Times New Roman" w:hAnsi="Consolas" w:cs="Times New Roman"/>
+          <w:color w:val="9CDCFE"/>
+          <w:sz w:val="21"/>
+          <w:szCs w:val="21"/>
+        </w:rPr>
+        <w:t>"test"</w:t>
+      </w:r>
+      <w:r>
+        <w:rPr>
+          <w:rFonts w:ascii="Consolas" w:eastAsia="Times New Roman" w:hAnsi="Consolas" w:cs="Times New Roman"/>
+          <w:color w:val="B4B4B4"/>
+          <w:sz w:val="21"/>
+          <w:szCs w:val="21"/>
+        </w:rPr>
+        <w:t>:</w:t>
+      </w:r>
+      <w:r>
+        <w:rPr>
+          <w:rFonts w:ascii="Consolas" w:eastAsia="Times New Roman" w:hAnsi="Consolas" w:cs="Times New Roman"/>
+          <w:color w:val="DADADA"/>
+          <w:sz w:val="21"/>
+          <w:szCs w:val="21"/>
+        </w:rPr>
+        <w:t xml:space="preserve"> </w:t>
+      </w:r>
+      <w:r>
+        <w:rPr>
+          <w:rFonts w:ascii="Consolas" w:eastAsia="Times New Roman" w:hAnsi="Consolas" w:cs="Times New Roman"/>
+          <w:color w:val="E8C9BB"/>
+          <w:sz w:val="21"/>
+          <w:szCs w:val="21"/>
+        </w:rPr>
+        <w:t>"</w:t>
+      </w:r>
+      <w:r>
+        <w:rPr>
+          <w:rFonts w:ascii="Consolas" w:eastAsia="Times New Roman" w:hAnsi="Consolas" w:cs="Times New Roman"/>
+          <w:color w:val="CE9178"/>
+          <w:sz w:val="21"/>
+          <w:szCs w:val="21"/>
+        </w:rPr>
+        <w:t xml:space="preserve">echo </w:t>
+      </w:r>
+      <w:r>
+        <w:rPr>
+          <w:rFonts w:ascii="Consolas" w:eastAsia="Times New Roman" w:hAnsi="Consolas" w:cs="Times New Roman"/>
+          <w:color w:val="FFD68F"/>
+          <w:sz w:val="21"/>
+          <w:szCs w:val="21"/>
+        </w:rPr>
+        <w:t>\"</w:t>
+      </w:r>
+      <w:r>
+        <w:rPr>
+          <w:rFonts w:ascii="Consolas" w:eastAsia="Times New Roman" w:hAnsi="Consolas" w:cs="Times New Roman"/>
+          <w:color w:val="CE9178"/>
+          <w:sz w:val="21"/>
+          <w:szCs w:val="21"/>
+        </w:rPr>
+        <w:t>Error: no test specified</w:t>
+      </w:r>
+      <w:r>
+        <w:rPr>
+          <w:rFonts w:ascii="Consolas" w:eastAsia="Times New Roman" w:hAnsi="Consolas" w:cs="Times New Roman"/>
+          <w:color w:val="FFD68F"/>
+          <w:sz w:val="21"/>
+          <w:szCs w:val="21"/>
+        </w:rPr>
+        <w:t>\"</w:t>
+      </w:r>
+      <w:r>
+        <w:rPr>
+          <w:rFonts w:ascii="Consolas" w:eastAsia="Times New Roman" w:hAnsi="Consolas" w:cs="Times New Roman"/>
+          <w:color w:val="CE9178"/>
+          <w:sz w:val="21"/>
+          <w:szCs w:val="21"/>
+        </w:rPr>
+        <w:t xml:space="preserve"> &amp;&amp; exit 1</w:t>
+      </w:r>
+      <w:r>
+        <w:rPr>
+          <w:rFonts w:ascii="Consolas" w:eastAsia="Times New Roman" w:hAnsi="Consolas" w:cs="Times New Roman"/>
+          <w:color w:val="E8C9BB"/>
+          <w:sz w:val="21"/>
+          <w:szCs w:val="21"/>
+        </w:rPr>
+        <w:t>"</w:t>
+      </w:r>
+    </w:p>
+    <w:p>
+      <w:pPr>
+        <w:shd w:val="clear" w:color="auto" w:fill="1E1E1E"/>
+        <w:spacing w:after="0" w:line="285" w:lineRule="atLeast"/>
+        <w:ind w:left="720"/>
+        <w:rPr>
+          <w:rFonts w:ascii="Consolas" w:eastAsia="Times New Roman" w:hAnsi="Consolas" w:cs="Times New Roman"/>
+          <w:color w:val="DADADA"/>
+          <w:sz w:val="21"/>
+          <w:szCs w:val="21"/>
+        </w:rPr>
+      </w:pPr>
+      <w:r>
+        <w:rPr>
+          <w:rFonts w:ascii="Consolas" w:eastAsia="Times New Roman" w:hAnsi="Consolas" w:cs="Times New Roman"/>
+          <w:color w:val="DADADA"/>
+          <w:sz w:val="21"/>
+          <w:szCs w:val="21"/>
+        </w:rPr>
         <w:t xml:space="preserve">  </w:t>
       </w:r>
       <w:r>
@@ -1560,6 +1696,974 @@
         <w:t>=&gt; chạy npm start thay vì phải nodemon index.js (--inspect dùng để debug)</w:t>
       </w:r>
     </w:p>
+    <w:p/>
+    <w:p>
+      <w:r>
+        <w:t xml:space="preserve">- Cài thư viện </w:t>
+      </w:r>
+      <w:r>
+        <w:rPr>
+          <w:b/>
+          <w:bCs/>
+        </w:rPr>
+        <w:t>morgan</w:t>
+      </w:r>
+      <w:r>
+        <w:t xml:space="preserve"> (mỗi yêu cầu với phương thức http =&gt; ko nhìn thấy log. Morgan giúp nhìn đc log)</w:t>
+      </w:r>
+    </w:p>
+    <w:p>
+      <w:pPr>
+        <w:rPr>
+          <w:b/>
+          <w:bCs/>
+          <w:color w:val="FF0000"/>
+        </w:rPr>
+      </w:pPr>
+      <w:r>
+        <w:tab/>
+      </w:r>
+      <w:r>
+        <w:rPr>
+          <w:b/>
+          <w:bCs/>
+          <w:color w:val="FF0000"/>
+        </w:rPr>
+        <w:t>npm install morgan --save-dev</w:t>
+      </w:r>
+    </w:p>
+    <w:p>
+      <w:r>
+        <w:tab/>
+      </w:r>
+    </w:p>
+    <w:p>
+      <w:r>
+        <w:tab/>
+        <w:t>Sử dụng:</w:t>
+      </w:r>
+    </w:p>
+    <w:p>
+      <w:pPr>
+        <w:shd w:val="clear" w:color="auto" w:fill="1E1E1E"/>
+        <w:spacing w:after="0" w:line="285" w:lineRule="atLeast"/>
+        <w:ind w:left="720"/>
+        <w:rPr>
+          <w:rFonts w:ascii="Consolas" w:eastAsia="Times New Roman" w:hAnsi="Consolas" w:cs="Times New Roman"/>
+          <w:color w:val="DADADA"/>
+          <w:sz w:val="21"/>
+          <w:szCs w:val="21"/>
+        </w:rPr>
+      </w:pPr>
+      <w:r>
+        <w:rPr>
+          <w:rFonts w:ascii="Consolas" w:eastAsia="Times New Roman" w:hAnsi="Consolas" w:cs="Times New Roman"/>
+          <w:color w:val="C8C8C8"/>
+          <w:sz w:val="21"/>
+          <w:szCs w:val="21"/>
+        </w:rPr>
+        <w:t xml:space="preserve">  </w:t>
+      </w:r>
+      <w:r>
+        <w:rPr>
+          <w:rFonts w:ascii="Consolas" w:eastAsia="Times New Roman" w:hAnsi="Consolas" w:cs="Times New Roman"/>
+          <w:color w:val="C8C8C8"/>
+          <w:sz w:val="21"/>
+          <w:szCs w:val="21"/>
+        </w:rPr>
+        <w:t>app</w:t>
+      </w:r>
+      <w:r>
+        <w:rPr>
+          <w:rFonts w:ascii="Consolas" w:eastAsia="Times New Roman" w:hAnsi="Consolas" w:cs="Times New Roman"/>
+          <w:color w:val="B4B4B4"/>
+          <w:sz w:val="21"/>
+          <w:szCs w:val="21"/>
+        </w:rPr>
+        <w:t>.</w:t>
+      </w:r>
+      <w:r>
+        <w:rPr>
+          <w:rFonts w:ascii="Consolas" w:eastAsia="Times New Roman" w:hAnsi="Consolas" w:cs="Times New Roman"/>
+          <w:color w:val="DCDCAA"/>
+          <w:sz w:val="21"/>
+          <w:szCs w:val="21"/>
+        </w:rPr>
+        <w:t>use</w:t>
+      </w:r>
+      <w:r>
+        <w:rPr>
+          <w:rFonts w:ascii="Consolas" w:eastAsia="Times New Roman" w:hAnsi="Consolas" w:cs="Times New Roman"/>
+          <w:color w:val="DADADA"/>
+          <w:sz w:val="21"/>
+          <w:szCs w:val="21"/>
+        </w:rPr>
+        <w:t>(</w:t>
+      </w:r>
+      <w:r>
+        <w:rPr>
+          <w:rFonts w:ascii="Consolas" w:eastAsia="Times New Roman" w:hAnsi="Consolas" w:cs="Times New Roman"/>
+          <w:color w:val="DCDCAA"/>
+          <w:sz w:val="21"/>
+          <w:szCs w:val="21"/>
+        </w:rPr>
+        <w:t>morgan</w:t>
+      </w:r>
+      <w:r>
+        <w:rPr>
+          <w:rFonts w:ascii="Consolas" w:eastAsia="Times New Roman" w:hAnsi="Consolas" w:cs="Times New Roman"/>
+          <w:color w:val="DADADA"/>
+          <w:sz w:val="21"/>
+          <w:szCs w:val="21"/>
+        </w:rPr>
+        <w:t>(</w:t>
+      </w:r>
+      <w:r>
+        <w:rPr>
+          <w:rFonts w:ascii="Consolas" w:eastAsia="Times New Roman" w:hAnsi="Consolas" w:cs="Times New Roman"/>
+          <w:color w:val="E8C9BB"/>
+          <w:sz w:val="21"/>
+          <w:szCs w:val="21"/>
+        </w:rPr>
+        <w:t>'</w:t>
+      </w:r>
+      <w:r>
+        <w:rPr>
+          <w:rFonts w:ascii="Consolas" w:eastAsia="Times New Roman" w:hAnsi="Consolas" w:cs="Times New Roman"/>
+          <w:color w:val="CE9178"/>
+          <w:sz w:val="21"/>
+          <w:szCs w:val="21"/>
+        </w:rPr>
+        <w:t>combined</w:t>
+      </w:r>
+      <w:r>
+        <w:rPr>
+          <w:rFonts w:ascii="Consolas" w:eastAsia="Times New Roman" w:hAnsi="Consolas" w:cs="Times New Roman"/>
+          <w:color w:val="E8C9BB"/>
+          <w:sz w:val="21"/>
+          <w:szCs w:val="21"/>
+        </w:rPr>
+        <w:t>'</w:t>
+      </w:r>
+      <w:r>
+        <w:rPr>
+          <w:rFonts w:ascii="Consolas" w:eastAsia="Times New Roman" w:hAnsi="Consolas" w:cs="Times New Roman"/>
+          <w:color w:val="DADADA"/>
+          <w:sz w:val="21"/>
+          <w:szCs w:val="21"/>
+        </w:rPr>
+        <w:t>))</w:t>
+      </w:r>
+    </w:p>
+    <w:p/>
+    <w:p>
+      <w:r>
+        <w:t xml:space="preserve">- Cài thư viện </w:t>
+      </w:r>
+      <w:r>
+        <w:rPr>
+          <w:b/>
+          <w:bCs/>
+        </w:rPr>
+        <w:t>Template engines (handlebar)</w:t>
+      </w:r>
+      <w:r>
+        <w:t xml:space="preserve"> (viết ra file html gọn gàn hơn ở nơi khác)</w:t>
+      </w:r>
+    </w:p>
+    <w:p>
+      <w:pPr>
+        <w:rPr>
+          <w:b/>
+          <w:bCs/>
+          <w:color w:val="FF0000"/>
+        </w:rPr>
+      </w:pPr>
+      <w:r>
+        <w:tab/>
+      </w:r>
+      <w:r>
+        <w:rPr>
+          <w:b/>
+          <w:bCs/>
+          <w:color w:val="FF0000"/>
+        </w:rPr>
+        <w:t xml:space="preserve">npm install </w:t>
+      </w:r>
+      <w:r>
+        <w:rPr>
+          <w:b/>
+          <w:bCs/>
+          <w:color w:val="FF0000"/>
+        </w:rPr>
+        <w:t xml:space="preserve">express-handlebars </w:t>
+      </w:r>
+      <w:r>
+        <w:rPr>
+          <w:b/>
+          <w:bCs/>
+          <w:color w:val="FF0000"/>
+        </w:rPr>
+        <w:t>--save-dev</w:t>
+      </w:r>
+    </w:p>
+    <w:p>
+      <w:pPr>
+        <w:rPr>
+          <w:b/>
+          <w:bCs/>
+          <w:color w:val="FF0000"/>
+        </w:rPr>
+      </w:pPr>
+    </w:p>
+    <w:p>
+      <w:r>
+        <w:rPr>
+          <w:b/>
+          <w:bCs/>
+          <w:color w:val="FF0000"/>
+        </w:rPr>
+        <w:tab/>
+      </w:r>
+      <w:r>
+        <w:t>cấu trúc file với express-handlebars</w:t>
+      </w:r>
+    </w:p>
+    <w:p>
+      <w:r>
+        <w:lastRenderedPageBreak/>
+        <w:tab/>
+      </w:r>
+      <w:r>
+        <w:drawing>
+          <wp:inline distT="0" distB="0" distL="0" distR="0" wp14:anchorId="77E99C8C" wp14:editId="2CC9C109">
+            <wp:extent cx="3551704" cy="1104595"/>
+            <wp:effectExtent l="0" t="0" r="0" b="635"/>
+            <wp:docPr id="1" name="Picture 1"/>
+            <wp:cNvGraphicFramePr>
+              <a:graphicFrameLocks xmlns:a="http://schemas.openxmlformats.org/drawingml/2006/main" noChangeAspect="1"/>
+            </wp:cNvGraphicFramePr>
+            <a:graphic xmlns:a="http://schemas.openxmlformats.org/drawingml/2006/main">
+              <a:graphicData uri="http://schemas.openxmlformats.org/drawingml/2006/picture">
+                <pic:pic xmlns:pic="http://schemas.openxmlformats.org/drawingml/2006/picture">
+                  <pic:nvPicPr>
+                    <pic:cNvPr id="1" name=""/>
+                    <pic:cNvPicPr/>
+                  </pic:nvPicPr>
+                  <pic:blipFill>
+                    <a:blip r:embed="rId4"/>
+                    <a:stretch>
+                      <a:fillRect/>
+                    </a:stretch>
+                  </pic:blipFill>
+                  <pic:spPr>
+                    <a:xfrm>
+                      <a:off x="0" y="0"/>
+                      <a:ext cx="3559925" cy="1107152"/>
+                    </a:xfrm>
+                    <a:prstGeom prst="rect">
+                      <a:avLst/>
+                    </a:prstGeom>
+                  </pic:spPr>
+                </pic:pic>
+              </a:graphicData>
+            </a:graphic>
+          </wp:inline>
+        </w:drawing>
+      </w:r>
+    </w:p>
+    <w:p/>
+    <w:p>
+      <w:r>
+        <w:tab/>
+        <w:t>Sử dụng:</w:t>
+      </w:r>
+    </w:p>
+    <w:p>
+      <w:pPr>
+        <w:shd w:val="clear" w:color="auto" w:fill="1E1E1E"/>
+        <w:spacing w:after="0" w:line="285" w:lineRule="atLeast"/>
+        <w:ind w:left="720"/>
+        <w:rPr>
+          <w:rFonts w:ascii="Consolas" w:eastAsia="Times New Roman" w:hAnsi="Consolas" w:cs="Times New Roman"/>
+          <w:color w:val="DADADA"/>
+          <w:sz w:val="21"/>
+          <w:szCs w:val="21"/>
+        </w:rPr>
+      </w:pPr>
+      <w:r>
+        <w:rPr>
+          <w:rFonts w:ascii="Consolas" w:eastAsia="Times New Roman" w:hAnsi="Consolas" w:cs="Times New Roman"/>
+          <w:color w:val="569CD6"/>
+          <w:sz w:val="21"/>
+          <w:szCs w:val="21"/>
+        </w:rPr>
+        <w:t>const</w:t>
+      </w:r>
+      <w:r>
+        <w:rPr>
+          <w:rFonts w:ascii="Consolas" w:eastAsia="Times New Roman" w:hAnsi="Consolas" w:cs="Times New Roman"/>
+          <w:color w:val="DADADA"/>
+          <w:sz w:val="21"/>
+          <w:szCs w:val="21"/>
+        </w:rPr>
+        <w:t xml:space="preserve"> </w:t>
+      </w:r>
+      <w:proofErr w:type="gramStart"/>
+      <w:r>
+        <w:rPr>
+          <w:rFonts w:ascii="Consolas" w:eastAsia="Times New Roman" w:hAnsi="Consolas" w:cs="Times New Roman"/>
+          <w:color w:val="B4B4B4"/>
+          <w:sz w:val="21"/>
+          <w:szCs w:val="21"/>
+        </w:rPr>
+        <w:t>{</w:t>
+      </w:r>
+      <w:r>
+        <w:rPr>
+          <w:rFonts w:ascii="Consolas" w:eastAsia="Times New Roman" w:hAnsi="Consolas" w:cs="Times New Roman"/>
+          <w:color w:val="DADADA"/>
+          <w:sz w:val="21"/>
+          <w:szCs w:val="21"/>
+        </w:rPr>
+        <w:t xml:space="preserve"> </w:t>
+      </w:r>
+      <w:r>
+        <w:rPr>
+          <w:rFonts w:ascii="Consolas" w:eastAsia="Times New Roman" w:hAnsi="Consolas" w:cs="Times New Roman"/>
+          <w:color w:val="DCDCAA"/>
+          <w:sz w:val="21"/>
+          <w:szCs w:val="21"/>
+        </w:rPr>
+        <w:t>engine</w:t>
+      </w:r>
+      <w:proofErr w:type="gramEnd"/>
+      <w:r>
+        <w:rPr>
+          <w:rFonts w:ascii="Consolas" w:eastAsia="Times New Roman" w:hAnsi="Consolas" w:cs="Times New Roman"/>
+          <w:color w:val="DADADA"/>
+          <w:sz w:val="21"/>
+          <w:szCs w:val="21"/>
+        </w:rPr>
+        <w:t xml:space="preserve"> </w:t>
+      </w:r>
+      <w:r>
+        <w:rPr>
+          <w:rFonts w:ascii="Consolas" w:eastAsia="Times New Roman" w:hAnsi="Consolas" w:cs="Times New Roman"/>
+          <w:color w:val="B4B4B4"/>
+          <w:sz w:val="21"/>
+          <w:szCs w:val="21"/>
+        </w:rPr>
+        <w:t>}</w:t>
+      </w:r>
+      <w:r>
+        <w:rPr>
+          <w:rFonts w:ascii="Consolas" w:eastAsia="Times New Roman" w:hAnsi="Consolas" w:cs="Times New Roman"/>
+          <w:color w:val="DADADA"/>
+          <w:sz w:val="21"/>
+          <w:szCs w:val="21"/>
+        </w:rPr>
+        <w:t xml:space="preserve"> </w:t>
+      </w:r>
+      <w:r>
+        <w:rPr>
+          <w:rFonts w:ascii="Consolas" w:eastAsia="Times New Roman" w:hAnsi="Consolas" w:cs="Times New Roman"/>
+          <w:color w:val="B4B4B4"/>
+          <w:sz w:val="21"/>
+          <w:szCs w:val="21"/>
+        </w:rPr>
+        <w:t>=</w:t>
+      </w:r>
+      <w:r>
+        <w:rPr>
+          <w:rFonts w:ascii="Consolas" w:eastAsia="Times New Roman" w:hAnsi="Consolas" w:cs="Times New Roman"/>
+          <w:color w:val="DADADA"/>
+          <w:sz w:val="21"/>
+          <w:szCs w:val="21"/>
+        </w:rPr>
+        <w:t xml:space="preserve"> </w:t>
+      </w:r>
+      <w:r>
+        <w:rPr>
+          <w:rFonts w:ascii="Consolas" w:eastAsia="Times New Roman" w:hAnsi="Consolas" w:cs="Times New Roman"/>
+          <w:color w:val="DCDCAA"/>
+          <w:sz w:val="21"/>
+          <w:szCs w:val="21"/>
+        </w:rPr>
+        <w:t>require</w:t>
+      </w:r>
+      <w:r>
+        <w:rPr>
+          <w:rFonts w:ascii="Consolas" w:eastAsia="Times New Roman" w:hAnsi="Consolas" w:cs="Times New Roman"/>
+          <w:color w:val="DADADA"/>
+          <w:sz w:val="21"/>
+          <w:szCs w:val="21"/>
+        </w:rPr>
+        <w:t>(</w:t>
+      </w:r>
+      <w:r>
+        <w:rPr>
+          <w:rFonts w:ascii="Consolas" w:eastAsia="Times New Roman" w:hAnsi="Consolas" w:cs="Times New Roman"/>
+          <w:color w:val="E8C9BB"/>
+          <w:sz w:val="21"/>
+          <w:szCs w:val="21"/>
+        </w:rPr>
+        <w:t>'</w:t>
+      </w:r>
+      <w:r>
+        <w:rPr>
+          <w:rFonts w:ascii="Consolas" w:eastAsia="Times New Roman" w:hAnsi="Consolas" w:cs="Times New Roman"/>
+          <w:color w:val="CE9178"/>
+          <w:sz w:val="21"/>
+          <w:szCs w:val="21"/>
+        </w:rPr>
+        <w:t>express-handlebars</w:t>
+      </w:r>
+      <w:r>
+        <w:rPr>
+          <w:rFonts w:ascii="Consolas" w:eastAsia="Times New Roman" w:hAnsi="Consolas" w:cs="Times New Roman"/>
+          <w:color w:val="E8C9BB"/>
+          <w:sz w:val="21"/>
+          <w:szCs w:val="21"/>
+        </w:rPr>
+        <w:t>'</w:t>
+      </w:r>
+      <w:r>
+        <w:rPr>
+          <w:rFonts w:ascii="Consolas" w:eastAsia="Times New Roman" w:hAnsi="Consolas" w:cs="Times New Roman"/>
+          <w:color w:val="DADADA"/>
+          <w:sz w:val="21"/>
+          <w:szCs w:val="21"/>
+        </w:rPr>
+        <w:t>)</w:t>
+      </w:r>
+      <w:r>
+        <w:rPr>
+          <w:rFonts w:ascii="Consolas" w:eastAsia="Times New Roman" w:hAnsi="Consolas" w:cs="Times New Roman"/>
+          <w:color w:val="B4B4B4"/>
+          <w:sz w:val="21"/>
+          <w:szCs w:val="21"/>
+        </w:rPr>
+        <w:t>;</w:t>
+      </w:r>
+    </w:p>
+    <w:p>
+      <w:pPr>
+        <w:shd w:val="clear" w:color="auto" w:fill="1E1E1E"/>
+        <w:spacing w:after="0" w:line="285" w:lineRule="atLeast"/>
+        <w:ind w:left="720"/>
+        <w:rPr>
+          <w:rFonts w:ascii="Consolas" w:eastAsia="Times New Roman" w:hAnsi="Consolas" w:cs="Times New Roman"/>
+          <w:color w:val="DADADA"/>
+          <w:sz w:val="21"/>
+          <w:szCs w:val="21"/>
+        </w:rPr>
+      </w:pPr>
+    </w:p>
+    <w:p>
+      <w:pPr>
+        <w:shd w:val="clear" w:color="auto" w:fill="1E1E1E"/>
+        <w:spacing w:after="0" w:line="285" w:lineRule="atLeast"/>
+        <w:ind w:left="720"/>
+        <w:rPr>
+          <w:rFonts w:ascii="Consolas" w:eastAsia="Times New Roman" w:hAnsi="Consolas" w:cs="Times New Roman"/>
+          <w:color w:val="DADADA"/>
+          <w:sz w:val="21"/>
+          <w:szCs w:val="21"/>
+        </w:rPr>
+      </w:pPr>
+      <w:r>
+        <w:rPr>
+          <w:rFonts w:ascii="Consolas" w:eastAsia="Times New Roman" w:hAnsi="Consolas" w:cs="Times New Roman"/>
+          <w:color w:val="57A64A"/>
+          <w:sz w:val="21"/>
+          <w:szCs w:val="21"/>
+        </w:rPr>
+        <w:t>// Template Engine</w:t>
+      </w:r>
+    </w:p>
+    <w:p>
+      <w:pPr>
+        <w:shd w:val="clear" w:color="auto" w:fill="1E1E1E"/>
+        <w:spacing w:after="0" w:line="285" w:lineRule="atLeast"/>
+        <w:ind w:left="720"/>
+        <w:rPr>
+          <w:rFonts w:ascii="Consolas" w:eastAsia="Times New Roman" w:hAnsi="Consolas" w:cs="Times New Roman"/>
+          <w:color w:val="DADADA"/>
+          <w:sz w:val="21"/>
+          <w:szCs w:val="21"/>
+        </w:rPr>
+      </w:pPr>
+      <w:proofErr w:type="gramStart"/>
+      <w:r>
+        <w:rPr>
+          <w:rFonts w:ascii="Consolas" w:eastAsia="Times New Roman" w:hAnsi="Consolas" w:cs="Times New Roman"/>
+          <w:color w:val="C8C8C8"/>
+          <w:sz w:val="21"/>
+          <w:szCs w:val="21"/>
+        </w:rPr>
+        <w:t>app</w:t>
+      </w:r>
+      <w:r>
+        <w:rPr>
+          <w:rFonts w:ascii="Consolas" w:eastAsia="Times New Roman" w:hAnsi="Consolas" w:cs="Times New Roman"/>
+          <w:color w:val="B4B4B4"/>
+          <w:sz w:val="21"/>
+          <w:szCs w:val="21"/>
+        </w:rPr>
+        <w:t>.</w:t>
+      </w:r>
+      <w:r>
+        <w:rPr>
+          <w:rFonts w:ascii="Consolas" w:eastAsia="Times New Roman" w:hAnsi="Consolas" w:cs="Times New Roman"/>
+          <w:color w:val="DCDCAA"/>
+          <w:sz w:val="21"/>
+          <w:szCs w:val="21"/>
+        </w:rPr>
+        <w:t>engine</w:t>
+      </w:r>
+      <w:proofErr w:type="gramEnd"/>
+      <w:r>
+        <w:rPr>
+          <w:rFonts w:ascii="Consolas" w:eastAsia="Times New Roman" w:hAnsi="Consolas" w:cs="Times New Roman"/>
+          <w:color w:val="DADADA"/>
+          <w:sz w:val="21"/>
+          <w:szCs w:val="21"/>
+        </w:rPr>
+        <w:t>(</w:t>
+      </w:r>
+      <w:r>
+        <w:rPr>
+          <w:rFonts w:ascii="Consolas" w:eastAsia="Times New Roman" w:hAnsi="Consolas" w:cs="Times New Roman"/>
+          <w:color w:val="E8C9BB"/>
+          <w:sz w:val="21"/>
+          <w:szCs w:val="21"/>
+        </w:rPr>
+        <w:t>'</w:t>
+      </w:r>
+      <w:r>
+        <w:rPr>
+          <w:rFonts w:ascii="Consolas" w:eastAsia="Times New Roman" w:hAnsi="Consolas" w:cs="Times New Roman"/>
+          <w:color w:val="CE9178"/>
+          <w:sz w:val="21"/>
+          <w:szCs w:val="21"/>
+        </w:rPr>
+        <w:t>handlebars</w:t>
+      </w:r>
+      <w:r>
+        <w:rPr>
+          <w:rFonts w:ascii="Consolas" w:eastAsia="Times New Roman" w:hAnsi="Consolas" w:cs="Times New Roman"/>
+          <w:color w:val="E8C9BB"/>
+          <w:sz w:val="21"/>
+          <w:szCs w:val="21"/>
+        </w:rPr>
+        <w:t>'</w:t>
+      </w:r>
+      <w:r>
+        <w:rPr>
+          <w:rFonts w:ascii="Consolas" w:eastAsia="Times New Roman" w:hAnsi="Consolas" w:cs="Times New Roman"/>
+          <w:color w:val="B4B4B4"/>
+          <w:sz w:val="21"/>
+          <w:szCs w:val="21"/>
+        </w:rPr>
+        <w:t>,</w:t>
+      </w:r>
+      <w:r>
+        <w:rPr>
+          <w:rFonts w:ascii="Consolas" w:eastAsia="Times New Roman" w:hAnsi="Consolas" w:cs="Times New Roman"/>
+          <w:color w:val="DADADA"/>
+          <w:sz w:val="21"/>
+          <w:szCs w:val="21"/>
+        </w:rPr>
+        <w:t xml:space="preserve"> </w:t>
+      </w:r>
+      <w:r>
+        <w:rPr>
+          <w:rFonts w:ascii="Consolas" w:eastAsia="Times New Roman" w:hAnsi="Consolas" w:cs="Times New Roman"/>
+          <w:color w:val="DCDCAA"/>
+          <w:sz w:val="21"/>
+          <w:szCs w:val="21"/>
+        </w:rPr>
+        <w:t>engine</w:t>
+      </w:r>
+      <w:r>
+        <w:rPr>
+          <w:rFonts w:ascii="Consolas" w:eastAsia="Times New Roman" w:hAnsi="Consolas" w:cs="Times New Roman"/>
+          <w:color w:val="DADADA"/>
+          <w:sz w:val="21"/>
+          <w:szCs w:val="21"/>
+        </w:rPr>
+        <w:t>())</w:t>
+      </w:r>
+      <w:r>
+        <w:rPr>
+          <w:rFonts w:ascii="Consolas" w:eastAsia="Times New Roman" w:hAnsi="Consolas" w:cs="Times New Roman"/>
+          <w:color w:val="B4B4B4"/>
+          <w:sz w:val="21"/>
+          <w:szCs w:val="21"/>
+        </w:rPr>
+        <w:t>;</w:t>
+      </w:r>
+    </w:p>
+    <w:p>
+      <w:pPr>
+        <w:shd w:val="clear" w:color="auto" w:fill="1E1E1E"/>
+        <w:spacing w:after="0" w:line="285" w:lineRule="atLeast"/>
+        <w:ind w:left="720"/>
+        <w:rPr>
+          <w:rFonts w:ascii="Consolas" w:eastAsia="Times New Roman" w:hAnsi="Consolas" w:cs="Times New Roman"/>
+          <w:color w:val="B4B4B4"/>
+          <w:sz w:val="21"/>
+          <w:szCs w:val="21"/>
+        </w:rPr>
+      </w:pPr>
+      <w:proofErr w:type="gramStart"/>
+      <w:r>
+        <w:rPr>
+          <w:rFonts w:ascii="Consolas" w:eastAsia="Times New Roman" w:hAnsi="Consolas" w:cs="Times New Roman"/>
+          <w:color w:val="C8C8C8"/>
+          <w:sz w:val="21"/>
+          <w:szCs w:val="21"/>
+        </w:rPr>
+        <w:t>app</w:t>
+      </w:r>
+      <w:r>
+        <w:rPr>
+          <w:rFonts w:ascii="Consolas" w:eastAsia="Times New Roman" w:hAnsi="Consolas" w:cs="Times New Roman"/>
+          <w:color w:val="B4B4B4"/>
+          <w:sz w:val="21"/>
+          <w:szCs w:val="21"/>
+        </w:rPr>
+        <w:t>.</w:t>
+      </w:r>
+      <w:r>
+        <w:rPr>
+          <w:rFonts w:ascii="Consolas" w:eastAsia="Times New Roman" w:hAnsi="Consolas" w:cs="Times New Roman"/>
+          <w:color w:val="DCDCAA"/>
+          <w:sz w:val="21"/>
+          <w:szCs w:val="21"/>
+        </w:rPr>
+        <w:t>set</w:t>
+      </w:r>
+      <w:r>
+        <w:rPr>
+          <w:rFonts w:ascii="Consolas" w:eastAsia="Times New Roman" w:hAnsi="Consolas" w:cs="Times New Roman"/>
+          <w:color w:val="DADADA"/>
+          <w:sz w:val="21"/>
+          <w:szCs w:val="21"/>
+        </w:rPr>
+        <w:t>(</w:t>
+      </w:r>
+      <w:proofErr w:type="gramEnd"/>
+      <w:r>
+        <w:rPr>
+          <w:rFonts w:ascii="Consolas" w:eastAsia="Times New Roman" w:hAnsi="Consolas" w:cs="Times New Roman"/>
+          <w:color w:val="E8C9BB"/>
+          <w:sz w:val="21"/>
+          <w:szCs w:val="21"/>
+        </w:rPr>
+        <w:t>'</w:t>
+      </w:r>
+      <w:r>
+        <w:rPr>
+          <w:rFonts w:ascii="Consolas" w:eastAsia="Times New Roman" w:hAnsi="Consolas" w:cs="Times New Roman"/>
+          <w:color w:val="CE9178"/>
+          <w:sz w:val="21"/>
+          <w:szCs w:val="21"/>
+        </w:rPr>
+        <w:t>view engine</w:t>
+      </w:r>
+      <w:r>
+        <w:rPr>
+          <w:rFonts w:ascii="Consolas" w:eastAsia="Times New Roman" w:hAnsi="Consolas" w:cs="Times New Roman"/>
+          <w:color w:val="E8C9BB"/>
+          <w:sz w:val="21"/>
+          <w:szCs w:val="21"/>
+        </w:rPr>
+        <w:t>'</w:t>
+      </w:r>
+      <w:r>
+        <w:rPr>
+          <w:rFonts w:ascii="Consolas" w:eastAsia="Times New Roman" w:hAnsi="Consolas" w:cs="Times New Roman"/>
+          <w:color w:val="B4B4B4"/>
+          <w:sz w:val="21"/>
+          <w:szCs w:val="21"/>
+        </w:rPr>
+        <w:t>,</w:t>
+      </w:r>
+      <w:r>
+        <w:rPr>
+          <w:rFonts w:ascii="Consolas" w:eastAsia="Times New Roman" w:hAnsi="Consolas" w:cs="Times New Roman"/>
+          <w:color w:val="DADADA"/>
+          <w:sz w:val="21"/>
+          <w:szCs w:val="21"/>
+        </w:rPr>
+        <w:t xml:space="preserve"> </w:t>
+      </w:r>
+      <w:r>
+        <w:rPr>
+          <w:rFonts w:ascii="Consolas" w:eastAsia="Times New Roman" w:hAnsi="Consolas" w:cs="Times New Roman"/>
+          <w:color w:val="E8C9BB"/>
+          <w:sz w:val="21"/>
+          <w:szCs w:val="21"/>
+        </w:rPr>
+        <w:t>'</w:t>
+      </w:r>
+      <w:r>
+        <w:rPr>
+          <w:rFonts w:ascii="Consolas" w:eastAsia="Times New Roman" w:hAnsi="Consolas" w:cs="Times New Roman"/>
+          <w:color w:val="CE9178"/>
+          <w:sz w:val="21"/>
+          <w:szCs w:val="21"/>
+        </w:rPr>
+        <w:t>handlebars</w:t>
+      </w:r>
+      <w:r>
+        <w:rPr>
+          <w:rFonts w:ascii="Consolas" w:eastAsia="Times New Roman" w:hAnsi="Consolas" w:cs="Times New Roman"/>
+          <w:color w:val="E8C9BB"/>
+          <w:sz w:val="21"/>
+          <w:szCs w:val="21"/>
+        </w:rPr>
+        <w:t>'</w:t>
+      </w:r>
+      <w:r>
+        <w:rPr>
+          <w:rFonts w:ascii="Consolas" w:eastAsia="Times New Roman" w:hAnsi="Consolas" w:cs="Times New Roman"/>
+          <w:color w:val="DADADA"/>
+          <w:sz w:val="21"/>
+          <w:szCs w:val="21"/>
+        </w:rPr>
+        <w:t>)</w:t>
+      </w:r>
+      <w:r>
+        <w:rPr>
+          <w:rFonts w:ascii="Consolas" w:eastAsia="Times New Roman" w:hAnsi="Consolas" w:cs="Times New Roman"/>
+          <w:color w:val="B4B4B4"/>
+          <w:sz w:val="21"/>
+          <w:szCs w:val="21"/>
+        </w:rPr>
+        <w:t>;</w:t>
+      </w:r>
+    </w:p>
+    <w:p>
+      <w:pPr>
+        <w:shd w:val="clear" w:color="auto" w:fill="1E1E1E"/>
+        <w:spacing w:after="0" w:line="285" w:lineRule="atLeast"/>
+        <w:ind w:left="720"/>
+        <w:rPr>
+          <w:rFonts w:ascii="Consolas" w:eastAsia="Times New Roman" w:hAnsi="Consolas" w:cs="Times New Roman"/>
+          <w:color w:val="B4B4B4"/>
+          <w:sz w:val="21"/>
+          <w:szCs w:val="21"/>
+        </w:rPr>
+      </w:pPr>
+    </w:p>
+    <w:p>
+      <w:pPr>
+        <w:shd w:val="clear" w:color="auto" w:fill="1E1E1E"/>
+        <w:spacing w:after="0" w:line="285" w:lineRule="atLeast"/>
+        <w:ind w:left="720"/>
+        <w:rPr>
+          <w:rFonts w:ascii="Consolas" w:eastAsia="Times New Roman" w:hAnsi="Consolas" w:cs="Times New Roman"/>
+          <w:color w:val="DADADA"/>
+          <w:sz w:val="21"/>
+          <w:szCs w:val="21"/>
+        </w:rPr>
+      </w:pPr>
+      <w:proofErr w:type="gramStart"/>
+      <w:r>
+        <w:rPr>
+          <w:rFonts w:ascii="Consolas" w:eastAsia="Times New Roman" w:hAnsi="Consolas" w:cs="Times New Roman"/>
+          <w:color w:val="C8C8C8"/>
+          <w:sz w:val="21"/>
+          <w:szCs w:val="21"/>
+        </w:rPr>
+        <w:t>app</w:t>
+      </w:r>
+      <w:r>
+        <w:rPr>
+          <w:rFonts w:ascii="Consolas" w:eastAsia="Times New Roman" w:hAnsi="Consolas" w:cs="Times New Roman"/>
+          <w:color w:val="B4B4B4"/>
+          <w:sz w:val="21"/>
+          <w:szCs w:val="21"/>
+        </w:rPr>
+        <w:t>.</w:t>
+      </w:r>
+      <w:r>
+        <w:rPr>
+          <w:rFonts w:ascii="Consolas" w:eastAsia="Times New Roman" w:hAnsi="Consolas" w:cs="Times New Roman"/>
+          <w:color w:val="DCDCAA"/>
+          <w:sz w:val="21"/>
+          <w:szCs w:val="21"/>
+        </w:rPr>
+        <w:t>set</w:t>
+      </w:r>
+      <w:r>
+        <w:rPr>
+          <w:rFonts w:ascii="Consolas" w:eastAsia="Times New Roman" w:hAnsi="Consolas" w:cs="Times New Roman"/>
+          <w:color w:val="DADADA"/>
+          <w:sz w:val="21"/>
+          <w:szCs w:val="21"/>
+        </w:rPr>
+        <w:t>(</w:t>
+      </w:r>
+      <w:proofErr w:type="gramEnd"/>
+      <w:r>
+        <w:rPr>
+          <w:rFonts w:ascii="Consolas" w:eastAsia="Times New Roman" w:hAnsi="Consolas" w:cs="Times New Roman"/>
+          <w:color w:val="E8C9BB"/>
+          <w:sz w:val="21"/>
+          <w:szCs w:val="21"/>
+        </w:rPr>
+        <w:t>'</w:t>
+      </w:r>
+      <w:r>
+        <w:rPr>
+          <w:rFonts w:ascii="Consolas" w:eastAsia="Times New Roman" w:hAnsi="Consolas" w:cs="Times New Roman"/>
+          <w:color w:val="CE9178"/>
+          <w:sz w:val="21"/>
+          <w:szCs w:val="21"/>
+        </w:rPr>
+        <w:t>views</w:t>
+      </w:r>
+      <w:r>
+        <w:rPr>
+          <w:rFonts w:ascii="Consolas" w:eastAsia="Times New Roman" w:hAnsi="Consolas" w:cs="Times New Roman"/>
+          <w:color w:val="E8C9BB"/>
+          <w:sz w:val="21"/>
+          <w:szCs w:val="21"/>
+        </w:rPr>
+        <w:t>'</w:t>
+      </w:r>
+      <w:r>
+        <w:rPr>
+          <w:rFonts w:ascii="Consolas" w:eastAsia="Times New Roman" w:hAnsi="Consolas" w:cs="Times New Roman"/>
+          <w:color w:val="B4B4B4"/>
+          <w:sz w:val="21"/>
+          <w:szCs w:val="21"/>
+        </w:rPr>
+        <w:t>,</w:t>
+      </w:r>
+      <w:r>
+        <w:rPr>
+          <w:rFonts w:ascii="Consolas" w:eastAsia="Times New Roman" w:hAnsi="Consolas" w:cs="Times New Roman"/>
+          <w:color w:val="DADADA"/>
+          <w:sz w:val="21"/>
+          <w:szCs w:val="21"/>
+        </w:rPr>
+        <w:t xml:space="preserve"> </w:t>
+      </w:r>
+      <w:r>
+        <w:rPr>
+          <w:rFonts w:ascii="Consolas" w:eastAsia="Times New Roman" w:hAnsi="Consolas" w:cs="Times New Roman"/>
+          <w:color w:val="C8C8C8"/>
+          <w:sz w:val="21"/>
+          <w:szCs w:val="21"/>
+        </w:rPr>
+        <w:t>path</w:t>
+      </w:r>
+      <w:r>
+        <w:rPr>
+          <w:rFonts w:ascii="Consolas" w:eastAsia="Times New Roman" w:hAnsi="Consolas" w:cs="Times New Roman"/>
+          <w:color w:val="B4B4B4"/>
+          <w:sz w:val="21"/>
+          <w:szCs w:val="21"/>
+        </w:rPr>
+        <w:t>.</w:t>
+      </w:r>
+      <w:r>
+        <w:rPr>
+          <w:rFonts w:ascii="Consolas" w:eastAsia="Times New Roman" w:hAnsi="Consolas" w:cs="Times New Roman"/>
+          <w:color w:val="DCDCAA"/>
+          <w:sz w:val="21"/>
+          <w:szCs w:val="21"/>
+        </w:rPr>
+        <w:t>join</w:t>
+      </w:r>
+      <w:r>
+        <w:rPr>
+          <w:rFonts w:ascii="Consolas" w:eastAsia="Times New Roman" w:hAnsi="Consolas" w:cs="Times New Roman"/>
+          <w:color w:val="DADADA"/>
+          <w:sz w:val="21"/>
+          <w:szCs w:val="21"/>
+        </w:rPr>
+        <w:t>(</w:t>
+      </w:r>
+      <w:r>
+        <w:rPr>
+          <w:rFonts w:ascii="Consolas" w:eastAsia="Times New Roman" w:hAnsi="Consolas" w:cs="Times New Roman"/>
+          <w:color w:val="9CDCFE"/>
+          <w:sz w:val="21"/>
+          <w:szCs w:val="21"/>
+        </w:rPr>
+        <w:t>__dirname</w:t>
+      </w:r>
+      <w:r>
+        <w:rPr>
+          <w:rFonts w:ascii="Consolas" w:eastAsia="Times New Roman" w:hAnsi="Consolas" w:cs="Times New Roman"/>
+          <w:color w:val="B4B4B4"/>
+          <w:sz w:val="21"/>
+          <w:szCs w:val="21"/>
+        </w:rPr>
+        <w:t>,</w:t>
+      </w:r>
+      <w:r>
+        <w:rPr>
+          <w:rFonts w:ascii="Consolas" w:eastAsia="Times New Roman" w:hAnsi="Consolas" w:cs="Times New Roman"/>
+          <w:color w:val="DADADA"/>
+          <w:sz w:val="21"/>
+          <w:szCs w:val="21"/>
+        </w:rPr>
+        <w:t xml:space="preserve"> </w:t>
+      </w:r>
+      <w:r>
+        <w:rPr>
+          <w:rFonts w:ascii="Consolas" w:eastAsia="Times New Roman" w:hAnsi="Consolas" w:cs="Times New Roman"/>
+          <w:color w:val="E8C9BB"/>
+          <w:sz w:val="21"/>
+          <w:szCs w:val="21"/>
+        </w:rPr>
+        <w:t>'</w:t>
+      </w:r>
+      <w:r>
+        <w:rPr>
+          <w:rFonts w:ascii="Consolas" w:eastAsia="Times New Roman" w:hAnsi="Consolas" w:cs="Times New Roman"/>
+          <w:color w:val="CE9178"/>
+          <w:sz w:val="21"/>
+          <w:szCs w:val="21"/>
+        </w:rPr>
+        <w:t>resources/views</w:t>
+      </w:r>
+      <w:r>
+        <w:rPr>
+          <w:rFonts w:ascii="Consolas" w:eastAsia="Times New Roman" w:hAnsi="Consolas" w:cs="Times New Roman"/>
+          <w:color w:val="E8C9BB"/>
+          <w:sz w:val="21"/>
+          <w:szCs w:val="21"/>
+        </w:rPr>
+        <w:t>'</w:t>
+      </w:r>
+      <w:r>
+        <w:rPr>
+          <w:rFonts w:ascii="Consolas" w:eastAsia="Times New Roman" w:hAnsi="Consolas" w:cs="Times New Roman"/>
+          <w:color w:val="DADADA"/>
+          <w:sz w:val="21"/>
+          <w:szCs w:val="21"/>
+        </w:rPr>
+        <w:t>))</w:t>
+      </w:r>
+      <w:r>
+        <w:rPr>
+          <w:rFonts w:ascii="Consolas" w:eastAsia="Times New Roman" w:hAnsi="Consolas" w:cs="Times New Roman"/>
+          <w:color w:val="B4B4B4"/>
+          <w:sz w:val="21"/>
+          <w:szCs w:val="21"/>
+        </w:rPr>
+        <w:t>;</w:t>
+      </w:r>
+    </w:p>
+    <w:p/>
     <w:p/>
     <w:sectPr>
       <w:pgSz w:w="12240" w:h="15840"/>
@@ -1969,12 +3073,11 @@
   <w:style w:type="paragraph" w:default="1" w:styleId="Normal">
     <w:name w:val="Normal"/>
     <w:qFormat/>
-    <w:rsid w:val="006C5483"/>
+    <w:rsid w:val="00750292"/>
   </w:style>
   <w:style w:type="character" w:default="1" w:styleId="DefaultParagraphFont">
     <w:name w:val="Default Paragraph Font"/>
     <w:uiPriority w:val="1"/>
-    <w:semiHidden/>
     <w:unhideWhenUsed/>
   </w:style>
   <w:style w:type="table" w:default="1" w:styleId="TableNormal">

</xml_diff>